<commit_message>
salaboju docs prieks skolas
yuh
</commit_message>
<xml_diff>
--- a/docs/modelis.docx
+++ b/docs/modelis.docx
@@ -1,6 +1,6 @@
 
 <file path=word/document.xml><?xml version="1.0" encoding="utf-8"?>
-<w:document xmlns:wpc="http://schemas.microsoft.com/office/word/2010/wordprocessingCanvas" xmlns:cx="http://schemas.microsoft.com/office/drawing/2014/chartex" xmlns:cx1="http://schemas.microsoft.com/office/drawing/2015/9/8/chartex" xmlns:cx2="http://schemas.microsoft.com/office/drawing/2015/10/21/chartex" xmlns:cx3="http://schemas.microsoft.com/office/drawing/2016/5/9/chartex" xmlns:cx4="http://schemas.microsoft.com/office/drawing/2016/5/10/chartex" xmlns:cx5="http://schemas.microsoft.com/office/drawing/2016/5/11/chartex" xmlns:cx6="http://schemas.microsoft.com/office/drawing/2016/5/12/chartex" xmlns:cx7="http://schemas.microsoft.com/office/drawing/2016/5/13/chartex" xmlns:cx8="http://schemas.microsoft.com/office/drawing/2016/5/14/chartex" xmlns:mc="http://schemas.openxmlformats.org/markup-compatibility/2006" xmlns:aink="http://schemas.microsoft.com/office/drawing/2016/ink" xmlns:am3d="http://schemas.microsoft.com/office/drawing/2017/model3d" xmlns:o="urn:schemas-microsoft-com:office:office" xmlns:oel="http://schemas.microsoft.com/office/2019/extlst" xmlns:r="http://schemas.openxmlformats.org/officeDocument/2006/relationships" xmlns:m="http://schemas.openxmlformats.org/officeDocument/2006/math" xmlns:v="urn:schemas-microsoft-com:vml" xmlns:wp14="http://schemas.microsoft.com/office/word/2010/wordprocessingDrawing" xmlns:wp="http://schemas.openxmlformats.org/drawingml/2006/wordprocessingDrawing" xmlns:w10="urn:schemas-microsoft-com:office:word" xmlns:w="http://schemas.openxmlformats.org/wordprocessingml/2006/main" xmlns:w14="http://schemas.microsoft.com/office/word/2010/wordml" xmlns:w15="http://schemas.microsoft.com/office/word/2012/wordml" xmlns:w16cex="http://schemas.microsoft.com/office/word/2018/wordml/cex" xmlns:w16cid="http://schemas.microsoft.com/office/word/2016/wordml/cid" xmlns:w16="http://schemas.microsoft.com/office/word/2018/wordml" xmlns:w16du="http://schemas.microsoft.com/office/word/2023/wordml/word16du" xmlns:w16sdtdh="http://schemas.microsoft.com/office/word/2020/wordml/sdtdatahash" xmlns:w16se="http://schemas.microsoft.com/office/word/2015/wordml/symex" xmlns:wpg="http://schemas.microsoft.com/office/word/2010/wordprocessingGroup" xmlns:wpi="http://schemas.microsoft.com/office/word/2010/wordprocessingInk" xmlns:wne="http://schemas.microsoft.com/office/word/2006/wordml" xmlns:wps="http://schemas.microsoft.com/office/word/2010/wordprocessingShape" mc:Ignorable="w14 w15 w16se w16cid w16 w16cex w16sdtdh w16du wp14">
+<w:document xmlns:wpc="http://schemas.microsoft.com/office/word/2010/wordprocessingCanvas" xmlns:cx="http://schemas.microsoft.com/office/drawing/2014/chartex" xmlns:mc="http://schemas.openxmlformats.org/markup-compatibility/2006" xmlns:o="urn:schemas-microsoft-com:office:office" xmlns:r="http://schemas.openxmlformats.org/officeDocument/2006/relationships" xmlns:m="http://schemas.openxmlformats.org/officeDocument/2006/math" xmlns:v="urn:schemas-microsoft-com:vml" xmlns:wp14="http://schemas.microsoft.com/office/word/2010/wordprocessingDrawing" xmlns:wp="http://schemas.openxmlformats.org/drawingml/2006/wordprocessingDrawing" xmlns:w10="urn:schemas-microsoft-com:office:word" xmlns:w="http://schemas.openxmlformats.org/wordprocessingml/2006/main" xmlns:w14="http://schemas.microsoft.com/office/word/2010/wordml" xmlns:w15="http://schemas.microsoft.com/office/word/2012/wordml" xmlns:w16se="http://schemas.microsoft.com/office/word/2015/wordml/symex" xmlns:wpg="http://schemas.microsoft.com/office/word/2010/wordprocessingGroup" xmlns:wpi="http://schemas.microsoft.com/office/word/2010/wordprocessingInk" xmlns:wne="http://schemas.microsoft.com/office/word/2006/wordml" xmlns:wps="http://schemas.microsoft.com/office/word/2010/wordprocessingShape" mc:Ignorable="w14 w15 w16se wp14">
   <w:body>
     <w:p>
       <w:pPr>
@@ -18,14 +18,10 @@
     </w:p>
     <w:p>
       <w:r>
-        <w:rPr>
-          <w:noProof/>
-          <w:lang w:eastAsia="lv-LV"/>
-        </w:rPr>
         <w:drawing>
-          <wp:inline distT="0" distB="0" distL="0" distR="0" wp14:anchorId="5D17BAF7" wp14:editId="726C75B6">
-            <wp:extent cx="5210902" cy="4601217"/>
-            <wp:effectExtent l="0" t="0" r="8890" b="8890"/>
+          <wp:inline distT="0" distB="0" distL="0" distR="0" wp14:anchorId="400AABF8" wp14:editId="575CBA0C">
+            <wp:extent cx="5274310" cy="3720465"/>
+            <wp:effectExtent l="0" t="0" r="2540" b="0"/>
             <wp:docPr id="1" name="Picture 1"/>
             <wp:cNvGraphicFramePr>
               <a:graphicFrameLocks xmlns:a="http://schemas.openxmlformats.org/drawingml/2006/main" noChangeAspect="1"/>
@@ -46,7 +42,7 @@
                   <pic:spPr>
                     <a:xfrm>
                       <a:off x="0" y="0"/>
-                      <a:ext cx="5210902" cy="4601217"/>
+                      <a:ext cx="5274310" cy="3720465"/>
                     </a:xfrm>
                     <a:prstGeom prst="rect">
                       <a:avLst/>
@@ -86,6 +82,9 @@
         <w:t>rediget</w:t>
       </w:r>
       <w:r>
+        <w:t xml:space="preserve"> un dzēst</w:t>
+      </w:r>
+      <w:r>
         <w:t xml:space="preserve"> postus un komentarus</w:t>
       </w:r>
     </w:p>
@@ -98,7 +97,13 @@
         </w:numPr>
       </w:pPr>
       <w:r>
-        <w:t>Guests var redzet postus</w:t>
+        <w:t>Guests var apskatīt</w:t>
+      </w:r>
+      <w:r>
+        <w:t xml:space="preserve"> postus</w:t>
+      </w:r>
+      <w:r>
+        <w:t xml:space="preserve"> (spotus</w:t>
       </w:r>
     </w:p>
     <w:p>
@@ -110,7 +115,10 @@
         </w:numPr>
       </w:pPr>
       <w:r>
-        <w:t>Guests var redzet komentarus</w:t>
+        <w:t>Guests var lasīt</w:t>
+      </w:r>
+      <w:r>
+        <w:t xml:space="preserve"> komentarus</w:t>
       </w:r>
     </w:p>
     <w:p>
@@ -122,7 +130,22 @@
         </w:numPr>
       </w:pPr>
       <w:r>
-        <w:t>User var rakstit, redzet un dzest komentarus</w:t>
+        <w:t xml:space="preserve">User var rakstit, </w:t>
+      </w:r>
+      <w:r>
+        <w:t>lasīt</w:t>
+      </w:r>
+      <w:r>
+        <w:t>, rediģēt</w:t>
+      </w:r>
+      <w:r>
+        <w:t xml:space="preserve"> un dzest</w:t>
+      </w:r>
+      <w:r>
+        <w:t xml:space="preserve"> savus</w:t>
+      </w:r>
+      <w:r>
+        <w:t xml:space="preserve"> komentarus</w:t>
       </w:r>
     </w:p>
     <w:p>
@@ -164,7 +187,13 @@
         </w:numPr>
       </w:pPr>
       <w:r>
-        <w:t>User var pievienot, dzest postu (spotu)</w:t>
+        <w:t>User var pievienot, dzest</w:t>
+      </w:r>
+      <w:r>
+        <w:t>, rediģēt savu</w:t>
+      </w:r>
+      <w:r>
+        <w:t xml:space="preserve"> postu (spotu)</w:t>
       </w:r>
     </w:p>
     <w:p>
@@ -188,7 +217,94 @@
         </w:numPr>
       </w:pPr>
       <w:r>
-        <w:t xml:space="preserve">Mape attelo postus (spotus) </w:t>
+        <w:t>Map</w:t>
+      </w:r>
+      <w:r>
+        <w:t xml:space="preserve"> attē</w:t>
+      </w:r>
+      <w:r>
+        <w:t xml:space="preserve">lo </w:t>
+      </w:r>
+      <w:r>
+        <w:t>spotus</w:t>
+      </w:r>
+      <w:r>
+        <w:t xml:space="preserve"> </w:t>
+      </w:r>
+    </w:p>
+    <w:p>
+      <w:pPr>
+        <w:pStyle w:val="ListParagraph"/>
+        <w:numPr>
+          <w:ilvl w:val="0"/>
+          <w:numId w:val="1"/>
+        </w:numPr>
+      </w:pPr>
+      <w:r>
+        <w:t>Nospiežot uz post (spot), tas parādās kartē</w:t>
+      </w:r>
+    </w:p>
+    <w:p>
+      <w:pPr>
+        <w:pStyle w:val="ListParagraph"/>
+        <w:numPr>
+          <w:ilvl w:val="0"/>
+          <w:numId w:val="1"/>
+        </w:numPr>
+      </w:pPr>
+      <w:r>
+        <w:t>Useri var pievienot</w:t>
+      </w:r>
+      <w:r>
+        <w:t xml:space="preserve"> un noņemt</w:t>
+      </w:r>
+      <w:r>
+        <w:t xml:space="preserve"> likes</w:t>
+      </w:r>
+      <w:r>
+        <w:t xml:space="preserve"> postiem (spotiem)</w:t>
+      </w:r>
+    </w:p>
+    <w:p>
+      <w:pPr>
+        <w:pStyle w:val="ListParagraph"/>
+        <w:numPr>
+          <w:ilvl w:val="0"/>
+          <w:numId w:val="1"/>
+        </w:numPr>
+      </w:pPr>
+      <w:r>
+        <w:t>Likes parādās uz postiem (spotiem)</w:t>
+      </w:r>
+    </w:p>
+    <w:p>
+      <w:pPr>
+        <w:pStyle w:val="ListParagraph"/>
+        <w:numPr>
+          <w:ilvl w:val="0"/>
+          <w:numId w:val="1"/>
+        </w:numPr>
+      </w:pPr>
+      <w:r>
+        <w:t>Users vai pievienot</w:t>
+      </w:r>
+      <w:r>
+        <w:t xml:space="preserve"> un noņemt</w:t>
+      </w:r>
+      <w:r>
+        <w:t xml:space="preserve"> likes commentariem</w:t>
+      </w:r>
+    </w:p>
+    <w:p>
+      <w:pPr>
+        <w:pStyle w:val="ListParagraph"/>
+        <w:numPr>
+          <w:ilvl w:val="0"/>
+          <w:numId w:val="1"/>
+        </w:numPr>
+      </w:pPr>
+      <w:r>
+        <w:t>Comment likes paradas uz commentariem</w:t>
       </w:r>
     </w:p>
     <w:p/>
@@ -198,7 +314,6 @@
     <w:p/>
     <w:p/>
     <w:p/>
-    <w:p/>
     <w:p>
       <w:r>
         <w:t>User</w:t>
@@ -207,7 +322,7 @@
     <w:tbl>
       <w:tblPr>
         <w:tblStyle w:val="TableGrid"/>
-        <w:tblW w:w="9351" w:type="dxa"/>
+        <w:tblW w:w="8217" w:type="dxa"/>
         <w:tblLook w:val="04A0" w:firstRow="1" w:lastRow="0" w:firstColumn="1" w:lastColumn="0" w:noHBand="0" w:noVBand="1"/>
       </w:tblPr>
       <w:tblGrid>
@@ -216,7 +331,6 @@
         <w:gridCol w:w="642"/>
         <w:gridCol w:w="1141"/>
         <w:gridCol w:w="865"/>
-        <w:gridCol w:w="1134"/>
         <w:gridCol w:w="3755"/>
       </w:tblGrid>
       <w:tr>
@@ -268,16 +382,6 @@
         </w:tc>
         <w:tc>
           <w:tcPr>
-            <w:tcW w:w="1134" w:type="dxa"/>
-          </w:tcPr>
-          <w:p>
-            <w:r>
-              <w:t>Password</w:t>
-            </w:r>
-          </w:p>
-        </w:tc>
-        <w:tc>
-          <w:tcPr>
             <w:tcW w:w="3755" w:type="dxa"/>
           </w:tcPr>
           <w:p>
@@ -324,7 +428,7 @@
           </w:tcPr>
           <w:p>
             <w:r>
-              <w:t>String</w:t>
+              <w:t>String (20)</w:t>
             </w:r>
           </w:p>
         </w:tc>
@@ -334,17 +438,7 @@
           </w:tcPr>
           <w:p>
             <w:r>
-              <w:t>String</w:t>
-            </w:r>
-          </w:p>
-        </w:tc>
-        <w:tc>
-          <w:tcPr>
-            <w:tcW w:w="1134" w:type="dxa"/>
-          </w:tcPr>
-          <w:p>
-            <w:r>
-              <w:t>String</w:t>
+              <w:t>String (50)</w:t>
             </w:r>
           </w:p>
         </w:tc>
@@ -399,6 +493,11 @@
               <w:t>String</w:t>
             </w:r>
           </w:p>
+          <w:p>
+            <w:r>
+              <w:t>(20)</w:t>
+            </w:r>
+          </w:p>
         </w:tc>
         <w:tc>
           <w:tcPr>
@@ -409,14 +508,9 @@
               <w:t>String</w:t>
             </w:r>
           </w:p>
-        </w:tc>
-        <w:tc>
-          <w:tcPr>
-            <w:tcW w:w="1134" w:type="dxa"/>
-          </w:tcPr>
-          <w:p>
-            <w:r>
-              <w:t>String</w:t>
+          <w:p>
+            <w:r>
+              <w:t>(50)</w:t>
             </w:r>
           </w:p>
         </w:tc>
@@ -445,12 +539,12 @@
         <w:tblLook w:val="04A0" w:firstRow="1" w:lastRow="0" w:firstColumn="1" w:lastColumn="0" w:noHBand="0" w:noVBand="1"/>
       </w:tblPr>
       <w:tblGrid>
-        <w:gridCol w:w="1009"/>
-        <w:gridCol w:w="1166"/>
-        <w:gridCol w:w="1431"/>
+        <w:gridCol w:w="1012"/>
+        <w:gridCol w:w="1168"/>
+        <w:gridCol w:w="1432"/>
         <w:gridCol w:w="1465"/>
-        <w:gridCol w:w="1102"/>
-        <w:gridCol w:w="1073"/>
+        <w:gridCol w:w="1103"/>
+        <w:gridCol w:w="1066"/>
         <w:gridCol w:w="1050"/>
       </w:tblGrid>
       <w:tr>
@@ -510,7 +604,7 @@
           </w:tcPr>
           <w:p>
             <w:r>
-              <w:t>Karma</w:t>
+              <w:t>Likes</w:t>
             </w:r>
           </w:p>
         </w:tc>
@@ -544,6 +638,18 @@
             <w:r>
               <w:t>String</w:t>
             </w:r>
+            <w:r>
+              <w:t xml:space="preserve"> </w:t>
+            </w:r>
+            <w:r>
+              <w:t>(</w:t>
+            </w:r>
+            <w:r>
+              <w:t>3</w:t>
+            </w:r>
+            <w:r>
+              <w:t>0)</w:t>
+            </w:r>
           </w:p>
         </w:tc>
         <w:tc>
@@ -554,6 +660,21 @@
             <w:r>
               <w:t>String</w:t>
             </w:r>
+            <w:r>
+              <w:t xml:space="preserve"> </w:t>
+            </w:r>
+            <w:r>
+              <w:t>(</w:t>
+            </w:r>
+            <w:r>
+              <w:t>10</w:t>
+            </w:r>
+            <w:r>
+              <w:t>0</w:t>
+            </w:r>
+            <w:r>
+              <w:t>0)</w:t>
+            </w:r>
           </w:p>
         </w:tc>
         <w:tc>
@@ -563,6 +684,18 @@
           <w:p>
             <w:r>
               <w:t>String</w:t>
+            </w:r>
+            <w:r>
+              <w:t xml:space="preserve"> </w:t>
+            </w:r>
+            <w:r>
+              <w:t>(</w:t>
+            </w:r>
+            <w:r>
+              <w:t>3</w:t>
+            </w:r>
+            <w:r>
+              <w:t>0)</w:t>
             </w:r>
           </w:p>
         </w:tc>
@@ -675,7 +808,7 @@
           </w:tcPr>
           <w:p>
             <w:r>
-              <w:t>Karma</w:t>
+              <w:t>Likes</w:t>
             </w:r>
           </w:p>
         </w:tc>
@@ -721,6 +854,9 @@
           <w:p>
             <w:r>
               <w:t>String</w:t>
+            </w:r>
+            <w:r>
+              <w:t xml:space="preserve"> (1000)</w:t>
             </w:r>
           </w:p>
         </w:tc>
@@ -831,7 +967,7 @@
     <w:p/>
     <w:p>
       <w:r>
-        <w:t>Karma</w:t>
+        <w:t>Likes</w:t>
       </w:r>
     </w:p>
     <w:tbl>
@@ -915,6 +1051,9 @@
       <w:r>
         <w:t>Comment</w:t>
       </w:r>
+      <w:r>
+        <w:t xml:space="preserve"> Likes</w:t>
+      </w:r>
     </w:p>
     <w:tbl>
       <w:tblPr>
@@ -1013,6 +1152,7 @@
           <w:b/>
           <w:sz w:val="40"/>
         </w:rPr>
+        <w:lastRenderedPageBreak/>
         <w:t>Funkcionālās prasības:</w:t>
       </w:r>
     </w:p>
@@ -1189,6 +1329,13 @@
         <w:tab/>
         <w:t>Dzēst lietotājus ja nav paklausīgi.</w:t>
       </w:r>
+    </w:p>
+    <w:p>
+      <w:pPr>
+        <w:rPr>
+          <w:sz w:val="32"/>
+        </w:rPr>
+      </w:pPr>
     </w:p>
     <w:p>
       <w:pPr>
@@ -1570,25 +1717,214 @@
           <w:sz w:val="28"/>
         </w:rPr>
       </w:pPr>
-      <w:r>
-        <w:rPr>
-          <w:sz w:val="28"/>
-        </w:rPr>
-        <w:t>°</w:t>
-      </w:r>
-    </w:p>
-    <w:p>
-      <w:pPr>
-        <w:rPr>
-          <w:sz w:val="28"/>
-        </w:rPr>
-      </w:pPr>
-      <w:r>
-        <w:rPr>
-          <w:sz w:val="28"/>
-        </w:rPr>
-        <w:t>5 funkcinju prasinas</w:t>
-      </w:r>
+    </w:p>
+    <w:p>
+      <w:pPr>
+        <w:rPr>
+          <w:sz w:val="28"/>
+        </w:rPr>
+      </w:pPr>
+    </w:p>
+    <w:p>
+      <w:pPr>
+        <w:rPr>
+          <w:sz w:val="28"/>
+        </w:rPr>
+      </w:pPr>
+    </w:p>
+    <w:p>
+      <w:pPr>
+        <w:rPr>
+          <w:sz w:val="28"/>
+        </w:rPr>
+      </w:pPr>
+    </w:p>
+    <w:p>
+      <w:pPr>
+        <w:rPr>
+          <w:sz w:val="28"/>
+        </w:rPr>
+      </w:pPr>
+    </w:p>
+    <w:p>
+      <w:pPr>
+        <w:rPr>
+          <w:sz w:val="28"/>
+        </w:rPr>
+      </w:pPr>
+    </w:p>
+    <w:p>
+      <w:pPr>
+        <w:rPr>
+          <w:sz w:val="28"/>
+        </w:rPr>
+      </w:pPr>
+    </w:p>
+    <w:p>
+      <w:pPr>
+        <w:rPr>
+          <w:sz w:val="28"/>
+        </w:rPr>
+      </w:pPr>
+    </w:p>
+    <w:p>
+      <w:pPr>
+        <w:rPr>
+          <w:sz w:val="28"/>
+        </w:rPr>
+      </w:pPr>
+    </w:p>
+    <w:p>
+      <w:pPr>
+        <w:rPr>
+          <w:sz w:val="28"/>
+        </w:rPr>
+      </w:pPr>
+      <w:r>
+        <w:rPr>
+          <w:sz w:val="28"/>
+        </w:rPr>
+        <w:lastRenderedPageBreak/>
+        <w:t>Funkciju prasības:</w:t>
+      </w:r>
+    </w:p>
+    <w:p>
+      <w:pPr>
+        <w:pStyle w:val="ListParagraph"/>
+        <w:numPr>
+          <w:ilvl w:val="0"/>
+          <w:numId w:val="7"/>
+        </w:numPr>
+        <w:rPr>
+          <w:sz w:val="28"/>
+        </w:rPr>
+      </w:pPr>
+      <w:r>
+        <w:rPr>
+          <w:sz w:val="28"/>
+        </w:rPr>
+        <w:t xml:space="preserve">Reģistrēšanās: </w:t>
+      </w:r>
+      <w:r>
+        <w:rPr>
+          <w:sz w:val="28"/>
+        </w:rPr>
+        <w:t>reģistrācijas procesā visiem sakariem ir jāizmanto HTTPS, un OAuth marķieri ir jāšifrē, izmantoj</w:t>
+      </w:r>
+      <w:r>
+        <w:rPr>
+          <w:sz w:val="28"/>
+        </w:rPr>
+        <w:t>ot pārbaudītus algoritmus.</w:t>
+      </w:r>
+    </w:p>
+    <w:p>
+      <w:pPr>
+        <w:pStyle w:val="ListParagraph"/>
+        <w:numPr>
+          <w:ilvl w:val="0"/>
+          <w:numId w:val="7"/>
+        </w:numPr>
+        <w:rPr>
+          <w:sz w:val="28"/>
+        </w:rPr>
+      </w:pPr>
+      <w:r>
+        <w:rPr>
+          <w:sz w:val="28"/>
+        </w:rPr>
+        <w:t>Post (spot) minimālai ievietošanai nevajadzētu prastīt vairāk kā 15 sekundes. (Atrast lokāciju, uzrakstīt īsu aprakstu un postot)</w:t>
+      </w:r>
+    </w:p>
+    <w:p>
+      <w:pPr>
+        <w:pStyle w:val="ListParagraph"/>
+        <w:numPr>
+          <w:ilvl w:val="0"/>
+          <w:numId w:val="7"/>
+        </w:numPr>
+        <w:rPr>
+          <w:sz w:val="28"/>
+        </w:rPr>
+      </w:pPr>
+      <w:r>
+        <w:rPr>
+          <w:sz w:val="28"/>
+        </w:rPr>
+        <w:t>Postiem(spotiem), jāparādās akurāti uz kartes, lai user/guest var viegli saprast kur tas atrodas.</w:t>
+      </w:r>
+      <w:bookmarkStart w:id="0" w:name="_GoBack"/>
+      <w:bookmarkEnd w:id="0"/>
+    </w:p>
+    <w:p>
+      <w:pPr>
+        <w:pStyle w:val="ListParagraph"/>
+        <w:numPr>
+          <w:ilvl w:val="0"/>
+          <w:numId w:val="7"/>
+        </w:numPr>
+        <w:rPr>
+          <w:sz w:val="28"/>
+        </w:rPr>
+      </w:pPr>
+      <w:r>
+        <w:rPr>
+          <w:sz w:val="28"/>
+        </w:rPr>
+        <w:t xml:space="preserve">Like/dislike funkcijai </w:t>
+      </w:r>
+      <w:r>
+        <w:rPr>
+          <w:sz w:val="28"/>
+        </w:rPr>
+        <w:t xml:space="preserve">gan postiem (spotiem), gan commentiem </w:t>
+      </w:r>
+      <w:r>
+        <w:rPr>
+          <w:sz w:val="28"/>
+        </w:rPr>
+        <w:t xml:space="preserve">jānostrādā un jāparādās 3 sekunžu laikā </w:t>
+      </w:r>
+    </w:p>
+    <w:p>
+      <w:pPr>
+        <w:pStyle w:val="ListParagraph"/>
+        <w:numPr>
+          <w:ilvl w:val="0"/>
+          <w:numId w:val="7"/>
+        </w:numPr>
+        <w:rPr>
+          <w:sz w:val="28"/>
+        </w:rPr>
+      </w:pPr>
+      <w:r>
+        <w:rPr>
+          <w:sz w:val="28"/>
+        </w:rPr>
+        <w:t>Commentiem jāparādās ne lēnāk kā 5 sekunžu laikā, kopš user tos atvēra.</w:t>
+      </w:r>
+    </w:p>
+    <w:p>
+      <w:pPr>
+        <w:ind w:left="720"/>
+        <w:rPr>
+          <w:sz w:val="28"/>
+        </w:rPr>
+      </w:pPr>
+    </w:p>
+    <w:p>
+      <w:pPr>
+        <w:rPr>
+          <w:sz w:val="28"/>
+        </w:rPr>
+      </w:pPr>
+    </w:p>
+    <w:p>
+      <w:pPr>
+        <w:rPr>
+          <w:sz w:val="28"/>
+        </w:rPr>
+      </w:pPr>
     </w:p>
     <w:sectPr>
       <w:pgSz w:w="11906" w:h="16838"/>
@@ -1601,7 +1937,7 @@
 </file>
 
 <file path=word/endnotes.xml><?xml version="1.0" encoding="utf-8"?>
-<w:endnotes xmlns:wpc="http://schemas.microsoft.com/office/word/2010/wordprocessingCanvas" xmlns:cx="http://schemas.microsoft.com/office/drawing/2014/chartex" xmlns:cx1="http://schemas.microsoft.com/office/drawing/2015/9/8/chartex" xmlns:cx2="http://schemas.microsoft.com/office/drawing/2015/10/21/chartex" xmlns:cx3="http://schemas.microsoft.com/office/drawing/2016/5/9/chartex" xmlns:cx4="http://schemas.microsoft.com/office/drawing/2016/5/10/chartex" xmlns:cx5="http://schemas.microsoft.com/office/drawing/2016/5/11/chartex" xmlns:cx6="http://schemas.microsoft.com/office/drawing/2016/5/12/chartex" xmlns:cx7="http://schemas.microsoft.com/office/drawing/2016/5/13/chartex" xmlns:cx8="http://schemas.microsoft.com/office/drawing/2016/5/14/chartex" xmlns:mc="http://schemas.openxmlformats.org/markup-compatibility/2006" xmlns:aink="http://schemas.microsoft.com/office/drawing/2016/ink" xmlns:am3d="http://schemas.microsoft.com/office/drawing/2017/model3d" xmlns:o="urn:schemas-microsoft-com:office:office" xmlns:oel="http://schemas.microsoft.com/office/2019/extlst" xmlns:r="http://schemas.openxmlformats.org/officeDocument/2006/relationships" xmlns:m="http://schemas.openxmlformats.org/officeDocument/2006/math" xmlns:v="urn:schemas-microsoft-com:vml" xmlns:wp14="http://schemas.microsoft.com/office/word/2010/wordprocessingDrawing" xmlns:wp="http://schemas.openxmlformats.org/drawingml/2006/wordprocessingDrawing" xmlns:w10="urn:schemas-microsoft-com:office:word" xmlns:w="http://schemas.openxmlformats.org/wordprocessingml/2006/main" xmlns:w14="http://schemas.microsoft.com/office/word/2010/wordml" xmlns:w15="http://schemas.microsoft.com/office/word/2012/wordml" xmlns:w16cex="http://schemas.microsoft.com/office/word/2018/wordml/cex" xmlns:w16cid="http://schemas.microsoft.com/office/word/2016/wordml/cid" xmlns:w16="http://schemas.microsoft.com/office/word/2018/wordml" xmlns:w16du="http://schemas.microsoft.com/office/word/2023/wordml/word16du" xmlns:w16sdtdh="http://schemas.microsoft.com/office/word/2020/wordml/sdtdatahash" xmlns:w16se="http://schemas.microsoft.com/office/word/2015/wordml/symex" xmlns:wpg="http://schemas.microsoft.com/office/word/2010/wordprocessingGroup" xmlns:wpi="http://schemas.microsoft.com/office/word/2010/wordprocessingInk" xmlns:wne="http://schemas.microsoft.com/office/word/2006/wordml" xmlns:wps="http://schemas.microsoft.com/office/word/2010/wordprocessingShape" mc:Ignorable="w14 w15 w16se w16cid w16 w16cex w16sdtdh w16du wp14">
+<w:endnotes xmlns:wpc="http://schemas.microsoft.com/office/word/2010/wordprocessingCanvas" xmlns:cx="http://schemas.microsoft.com/office/drawing/2014/chartex" xmlns:mc="http://schemas.openxmlformats.org/markup-compatibility/2006" xmlns:o="urn:schemas-microsoft-com:office:office" xmlns:r="http://schemas.openxmlformats.org/officeDocument/2006/relationships" xmlns:m="http://schemas.openxmlformats.org/officeDocument/2006/math" xmlns:v="urn:schemas-microsoft-com:vml" xmlns:wp14="http://schemas.microsoft.com/office/word/2010/wordprocessingDrawing" xmlns:wp="http://schemas.openxmlformats.org/drawingml/2006/wordprocessingDrawing" xmlns:w10="urn:schemas-microsoft-com:office:word" xmlns:w="http://schemas.openxmlformats.org/wordprocessingml/2006/main" xmlns:w14="http://schemas.microsoft.com/office/word/2010/wordml" xmlns:w15="http://schemas.microsoft.com/office/word/2012/wordml" xmlns:w16se="http://schemas.microsoft.com/office/word/2015/wordml/symex" xmlns:wpg="http://schemas.microsoft.com/office/word/2010/wordprocessingGroup" xmlns:wpi="http://schemas.microsoft.com/office/word/2010/wordprocessingInk" xmlns:wne="http://schemas.microsoft.com/office/word/2006/wordml" xmlns:wps="http://schemas.microsoft.com/office/word/2010/wordprocessingShape" mc:Ignorable="w14 w15 w16se wp14">
   <w:endnote w:type="separator" w:id="-1">
     <w:p>
       <w:pPr>
@@ -1626,7 +1962,7 @@
 </file>
 
 <file path=word/footnotes.xml><?xml version="1.0" encoding="utf-8"?>
-<w:footnotes xmlns:wpc="http://schemas.microsoft.com/office/word/2010/wordprocessingCanvas" xmlns:cx="http://schemas.microsoft.com/office/drawing/2014/chartex" xmlns:cx1="http://schemas.microsoft.com/office/drawing/2015/9/8/chartex" xmlns:cx2="http://schemas.microsoft.com/office/drawing/2015/10/21/chartex" xmlns:cx3="http://schemas.microsoft.com/office/drawing/2016/5/9/chartex" xmlns:cx4="http://schemas.microsoft.com/office/drawing/2016/5/10/chartex" xmlns:cx5="http://schemas.microsoft.com/office/drawing/2016/5/11/chartex" xmlns:cx6="http://schemas.microsoft.com/office/drawing/2016/5/12/chartex" xmlns:cx7="http://schemas.microsoft.com/office/drawing/2016/5/13/chartex" xmlns:cx8="http://schemas.microsoft.com/office/drawing/2016/5/14/chartex" xmlns:mc="http://schemas.openxmlformats.org/markup-compatibility/2006" xmlns:aink="http://schemas.microsoft.com/office/drawing/2016/ink" xmlns:am3d="http://schemas.microsoft.com/office/drawing/2017/model3d" xmlns:o="urn:schemas-microsoft-com:office:office" xmlns:oel="http://schemas.microsoft.com/office/2019/extlst" xmlns:r="http://schemas.openxmlformats.org/officeDocument/2006/relationships" xmlns:m="http://schemas.openxmlformats.org/officeDocument/2006/math" xmlns:v="urn:schemas-microsoft-com:vml" xmlns:wp14="http://schemas.microsoft.com/office/word/2010/wordprocessingDrawing" xmlns:wp="http://schemas.openxmlformats.org/drawingml/2006/wordprocessingDrawing" xmlns:w10="urn:schemas-microsoft-com:office:word" xmlns:w="http://schemas.openxmlformats.org/wordprocessingml/2006/main" xmlns:w14="http://schemas.microsoft.com/office/word/2010/wordml" xmlns:w15="http://schemas.microsoft.com/office/word/2012/wordml" xmlns:w16cex="http://schemas.microsoft.com/office/word/2018/wordml/cex" xmlns:w16cid="http://schemas.microsoft.com/office/word/2016/wordml/cid" xmlns:w16="http://schemas.microsoft.com/office/word/2018/wordml" xmlns:w16du="http://schemas.microsoft.com/office/word/2023/wordml/word16du" xmlns:w16sdtdh="http://schemas.microsoft.com/office/word/2020/wordml/sdtdatahash" xmlns:w16se="http://schemas.microsoft.com/office/word/2015/wordml/symex" xmlns:wpg="http://schemas.microsoft.com/office/word/2010/wordprocessingGroup" xmlns:wpi="http://schemas.microsoft.com/office/word/2010/wordprocessingInk" xmlns:wne="http://schemas.microsoft.com/office/word/2006/wordml" xmlns:wps="http://schemas.microsoft.com/office/word/2010/wordprocessingShape" mc:Ignorable="w14 w15 w16se w16cid w16 w16cex w16sdtdh w16du wp14">
+<w:footnotes xmlns:wpc="http://schemas.microsoft.com/office/word/2010/wordprocessingCanvas" xmlns:cx="http://schemas.microsoft.com/office/drawing/2014/chartex" xmlns:mc="http://schemas.openxmlformats.org/markup-compatibility/2006" xmlns:o="urn:schemas-microsoft-com:office:office" xmlns:r="http://schemas.openxmlformats.org/officeDocument/2006/relationships" xmlns:m="http://schemas.openxmlformats.org/officeDocument/2006/math" xmlns:v="urn:schemas-microsoft-com:vml" xmlns:wp14="http://schemas.microsoft.com/office/word/2010/wordprocessingDrawing" xmlns:wp="http://schemas.openxmlformats.org/drawingml/2006/wordprocessingDrawing" xmlns:w10="urn:schemas-microsoft-com:office:word" xmlns:w="http://schemas.openxmlformats.org/wordprocessingml/2006/main" xmlns:w14="http://schemas.microsoft.com/office/word/2010/wordml" xmlns:w15="http://schemas.microsoft.com/office/word/2012/wordml" xmlns:w16se="http://schemas.microsoft.com/office/word/2015/wordml/symex" xmlns:wpg="http://schemas.microsoft.com/office/word/2010/wordprocessingGroup" xmlns:wpi="http://schemas.microsoft.com/office/word/2010/wordprocessingInk" xmlns:wne="http://schemas.microsoft.com/office/word/2006/wordml" xmlns:wps="http://schemas.microsoft.com/office/word/2010/wordprocessingShape" mc:Ignorable="w14 w15 w16se wp14">
   <w:footnote w:type="separator" w:id="-1">
     <w:p>
       <w:pPr>
@@ -1651,7 +1987,7 @@
 </file>
 
 <file path=word/numbering.xml><?xml version="1.0" encoding="utf-8"?>
-<w:numbering xmlns:wpc="http://schemas.microsoft.com/office/word/2010/wordprocessingCanvas" xmlns:cx="http://schemas.microsoft.com/office/drawing/2014/chartex" xmlns:cx1="http://schemas.microsoft.com/office/drawing/2015/9/8/chartex" xmlns:cx2="http://schemas.microsoft.com/office/drawing/2015/10/21/chartex" xmlns:cx3="http://schemas.microsoft.com/office/drawing/2016/5/9/chartex" xmlns:cx4="http://schemas.microsoft.com/office/drawing/2016/5/10/chartex" xmlns:cx5="http://schemas.microsoft.com/office/drawing/2016/5/11/chartex" xmlns:cx6="http://schemas.microsoft.com/office/drawing/2016/5/12/chartex" xmlns:cx7="http://schemas.microsoft.com/office/drawing/2016/5/13/chartex" xmlns:cx8="http://schemas.microsoft.com/office/drawing/2016/5/14/chartex" xmlns:mc="http://schemas.openxmlformats.org/markup-compatibility/2006" xmlns:aink="http://schemas.microsoft.com/office/drawing/2016/ink" xmlns:am3d="http://schemas.microsoft.com/office/drawing/2017/model3d" xmlns:o="urn:schemas-microsoft-com:office:office" xmlns:oel="http://schemas.microsoft.com/office/2019/extlst" xmlns:r="http://schemas.openxmlformats.org/officeDocument/2006/relationships" xmlns:m="http://schemas.openxmlformats.org/officeDocument/2006/math" xmlns:v="urn:schemas-microsoft-com:vml" xmlns:wp14="http://schemas.microsoft.com/office/word/2010/wordprocessingDrawing" xmlns:wp="http://schemas.openxmlformats.org/drawingml/2006/wordprocessingDrawing" xmlns:w10="urn:schemas-microsoft-com:office:word" xmlns:w="http://schemas.openxmlformats.org/wordprocessingml/2006/main" xmlns:w14="http://schemas.microsoft.com/office/word/2010/wordml" xmlns:w15="http://schemas.microsoft.com/office/word/2012/wordml" xmlns:w16cex="http://schemas.microsoft.com/office/word/2018/wordml/cex" xmlns:w16cid="http://schemas.microsoft.com/office/word/2016/wordml/cid" xmlns:w16="http://schemas.microsoft.com/office/word/2018/wordml" xmlns:w16du="http://schemas.microsoft.com/office/word/2023/wordml/word16du" xmlns:w16sdtdh="http://schemas.microsoft.com/office/word/2020/wordml/sdtdatahash" xmlns:w16se="http://schemas.microsoft.com/office/word/2015/wordml/symex" xmlns:wpg="http://schemas.microsoft.com/office/word/2010/wordprocessingGroup" xmlns:wpi="http://schemas.microsoft.com/office/word/2010/wordprocessingInk" xmlns:wne="http://schemas.microsoft.com/office/word/2006/wordml" xmlns:wps="http://schemas.microsoft.com/office/word/2010/wordprocessingShape" mc:Ignorable="w14 w15 w16se w16cid w16 w16cex w16sdtdh w16du wp14">
+<w:numbering xmlns:wpc="http://schemas.microsoft.com/office/word/2010/wordprocessingCanvas" xmlns:cx="http://schemas.microsoft.com/office/drawing/2014/chartex" xmlns:mc="http://schemas.openxmlformats.org/markup-compatibility/2006" xmlns:o="urn:schemas-microsoft-com:office:office" xmlns:r="http://schemas.openxmlformats.org/officeDocument/2006/relationships" xmlns:m="http://schemas.openxmlformats.org/officeDocument/2006/math" xmlns:v="urn:schemas-microsoft-com:vml" xmlns:wp14="http://schemas.microsoft.com/office/word/2010/wordprocessingDrawing" xmlns:wp="http://schemas.openxmlformats.org/drawingml/2006/wordprocessingDrawing" xmlns:w10="urn:schemas-microsoft-com:office:word" xmlns:w="http://schemas.openxmlformats.org/wordprocessingml/2006/main" xmlns:w14="http://schemas.microsoft.com/office/word/2010/wordml" xmlns:w15="http://schemas.microsoft.com/office/word/2012/wordml" xmlns:w16se="http://schemas.microsoft.com/office/word/2015/wordml/symex" xmlns:wpg="http://schemas.microsoft.com/office/word/2010/wordprocessingGroup" xmlns:wpi="http://schemas.microsoft.com/office/word/2010/wordprocessingInk" xmlns:wne="http://schemas.microsoft.com/office/word/2006/wordml" xmlns:wps="http://schemas.microsoft.com/office/word/2010/wordprocessingShape" mc:Ignorable="w14 w15 w16se wp14">
   <w:abstractNum w:abstractNumId="0" w15:restartNumberingAfterBreak="0">
     <w:nsid w:val="2BF5051F"/>
     <w:multiLevelType w:val="hybridMultilevel"/>
@@ -1855,6 +2191,95 @@
     </w:lvl>
   </w:abstractNum>
   <w:abstractNum w:abstractNumId="2" w15:restartNumberingAfterBreak="0">
+    <w:nsid w:val="46877E38"/>
+    <w:multiLevelType w:val="hybridMultilevel"/>
+    <w:tmpl w:val="135E5012"/>
+    <w:lvl w:ilvl="0" w:tplc="4832251C">
+      <w:start w:val="1"/>
+      <w:numFmt w:val="decimal"/>
+      <w:lvlText w:val="%1."/>
+      <w:lvlJc w:val="left"/>
+      <w:pPr>
+        <w:ind w:left="1080" w:hanging="360"/>
+      </w:pPr>
+      <w:rPr>
+        <w:rFonts w:hint="default"/>
+      </w:rPr>
+    </w:lvl>
+    <w:lvl w:ilvl="1" w:tplc="04260019" w:tentative="1">
+      <w:start w:val="1"/>
+      <w:numFmt w:val="lowerLetter"/>
+      <w:lvlText w:val="%2."/>
+      <w:lvlJc w:val="left"/>
+      <w:pPr>
+        <w:ind w:left="1800" w:hanging="360"/>
+      </w:pPr>
+    </w:lvl>
+    <w:lvl w:ilvl="2" w:tplc="0426001B" w:tentative="1">
+      <w:start w:val="1"/>
+      <w:numFmt w:val="lowerRoman"/>
+      <w:lvlText w:val="%3."/>
+      <w:lvlJc w:val="right"/>
+      <w:pPr>
+        <w:ind w:left="2520" w:hanging="180"/>
+      </w:pPr>
+    </w:lvl>
+    <w:lvl w:ilvl="3" w:tplc="0426000F" w:tentative="1">
+      <w:start w:val="1"/>
+      <w:numFmt w:val="decimal"/>
+      <w:lvlText w:val="%4."/>
+      <w:lvlJc w:val="left"/>
+      <w:pPr>
+        <w:ind w:left="3240" w:hanging="360"/>
+      </w:pPr>
+    </w:lvl>
+    <w:lvl w:ilvl="4" w:tplc="04260019" w:tentative="1">
+      <w:start w:val="1"/>
+      <w:numFmt w:val="lowerLetter"/>
+      <w:lvlText w:val="%5."/>
+      <w:lvlJc w:val="left"/>
+      <w:pPr>
+        <w:ind w:left="3960" w:hanging="360"/>
+      </w:pPr>
+    </w:lvl>
+    <w:lvl w:ilvl="5" w:tplc="0426001B" w:tentative="1">
+      <w:start w:val="1"/>
+      <w:numFmt w:val="lowerRoman"/>
+      <w:lvlText w:val="%6."/>
+      <w:lvlJc w:val="right"/>
+      <w:pPr>
+        <w:ind w:left="4680" w:hanging="180"/>
+      </w:pPr>
+    </w:lvl>
+    <w:lvl w:ilvl="6" w:tplc="0426000F" w:tentative="1">
+      <w:start w:val="1"/>
+      <w:numFmt w:val="decimal"/>
+      <w:lvlText w:val="%7."/>
+      <w:lvlJc w:val="left"/>
+      <w:pPr>
+        <w:ind w:left="5400" w:hanging="360"/>
+      </w:pPr>
+    </w:lvl>
+    <w:lvl w:ilvl="7" w:tplc="04260019" w:tentative="1">
+      <w:start w:val="1"/>
+      <w:numFmt w:val="lowerLetter"/>
+      <w:lvlText w:val="%8."/>
+      <w:lvlJc w:val="left"/>
+      <w:pPr>
+        <w:ind w:left="6120" w:hanging="360"/>
+      </w:pPr>
+    </w:lvl>
+    <w:lvl w:ilvl="8" w:tplc="0426001B" w:tentative="1">
+      <w:start w:val="1"/>
+      <w:numFmt w:val="lowerRoman"/>
+      <w:lvlText w:val="%9."/>
+      <w:lvlJc w:val="right"/>
+      <w:pPr>
+        <w:ind w:left="6840" w:hanging="180"/>
+      </w:pPr>
+    </w:lvl>
+  </w:abstractNum>
+  <w:abstractNum w:abstractNumId="3" w15:restartNumberingAfterBreak="0">
     <w:nsid w:val="694727E3"/>
     <w:multiLevelType w:val="hybridMultilevel"/>
     <w:tmpl w:val="CCF8C84C"/>
@@ -1940,7 +2365,7 @@
       </w:pPr>
     </w:lvl>
   </w:abstractNum>
-  <w:abstractNum w:abstractNumId="3" w15:restartNumberingAfterBreak="0">
+  <w:abstractNum w:abstractNumId="4" w15:restartNumberingAfterBreak="0">
     <w:nsid w:val="6A614CDE"/>
     <w:multiLevelType w:val="hybridMultilevel"/>
     <w:tmpl w:val="5E820666"/>
@@ -2053,7 +2478,7 @@
       </w:rPr>
     </w:lvl>
   </w:abstractNum>
-  <w:abstractNum w:abstractNumId="4" w15:restartNumberingAfterBreak="0">
+  <w:abstractNum w:abstractNumId="5" w15:restartNumberingAfterBreak="0">
     <w:nsid w:val="73583846"/>
     <w:multiLevelType w:val="hybridMultilevel"/>
     <w:tmpl w:val="2174A840"/>
@@ -2166,26 +2591,121 @@
       </w:rPr>
     </w:lvl>
   </w:abstractNum>
-  <w:num w:numId="1" w16cid:durableId="587233763">
-    <w:abstractNumId w:val="2"/>
+  <w:abstractNum w:abstractNumId="6" w15:restartNumberingAfterBreak="0">
+    <w:nsid w:val="7F831185"/>
+    <w:multiLevelType w:val="hybridMultilevel"/>
+    <w:tmpl w:val="A9687DA6"/>
+    <w:lvl w:ilvl="0" w:tplc="10B4148C">
+      <w:start w:val="1"/>
+      <w:numFmt w:val="decimal"/>
+      <w:lvlText w:val="%1."/>
+      <w:lvlJc w:val="left"/>
+      <w:pPr>
+        <w:ind w:left="1080" w:hanging="360"/>
+      </w:pPr>
+      <w:rPr>
+        <w:rFonts w:hint="default"/>
+      </w:rPr>
+    </w:lvl>
+    <w:lvl w:ilvl="1" w:tplc="04260019" w:tentative="1">
+      <w:start w:val="1"/>
+      <w:numFmt w:val="lowerLetter"/>
+      <w:lvlText w:val="%2."/>
+      <w:lvlJc w:val="left"/>
+      <w:pPr>
+        <w:ind w:left="1800" w:hanging="360"/>
+      </w:pPr>
+    </w:lvl>
+    <w:lvl w:ilvl="2" w:tplc="0426001B" w:tentative="1">
+      <w:start w:val="1"/>
+      <w:numFmt w:val="lowerRoman"/>
+      <w:lvlText w:val="%3."/>
+      <w:lvlJc w:val="right"/>
+      <w:pPr>
+        <w:ind w:left="2520" w:hanging="180"/>
+      </w:pPr>
+    </w:lvl>
+    <w:lvl w:ilvl="3" w:tplc="0426000F" w:tentative="1">
+      <w:start w:val="1"/>
+      <w:numFmt w:val="decimal"/>
+      <w:lvlText w:val="%4."/>
+      <w:lvlJc w:val="left"/>
+      <w:pPr>
+        <w:ind w:left="3240" w:hanging="360"/>
+      </w:pPr>
+    </w:lvl>
+    <w:lvl w:ilvl="4" w:tplc="04260019" w:tentative="1">
+      <w:start w:val="1"/>
+      <w:numFmt w:val="lowerLetter"/>
+      <w:lvlText w:val="%5."/>
+      <w:lvlJc w:val="left"/>
+      <w:pPr>
+        <w:ind w:left="3960" w:hanging="360"/>
+      </w:pPr>
+    </w:lvl>
+    <w:lvl w:ilvl="5" w:tplc="0426001B" w:tentative="1">
+      <w:start w:val="1"/>
+      <w:numFmt w:val="lowerRoman"/>
+      <w:lvlText w:val="%6."/>
+      <w:lvlJc w:val="right"/>
+      <w:pPr>
+        <w:ind w:left="4680" w:hanging="180"/>
+      </w:pPr>
+    </w:lvl>
+    <w:lvl w:ilvl="6" w:tplc="0426000F" w:tentative="1">
+      <w:start w:val="1"/>
+      <w:numFmt w:val="decimal"/>
+      <w:lvlText w:val="%7."/>
+      <w:lvlJc w:val="left"/>
+      <w:pPr>
+        <w:ind w:left="5400" w:hanging="360"/>
+      </w:pPr>
+    </w:lvl>
+    <w:lvl w:ilvl="7" w:tplc="04260019" w:tentative="1">
+      <w:start w:val="1"/>
+      <w:numFmt w:val="lowerLetter"/>
+      <w:lvlText w:val="%8."/>
+      <w:lvlJc w:val="left"/>
+      <w:pPr>
+        <w:ind w:left="6120" w:hanging="360"/>
+      </w:pPr>
+    </w:lvl>
+    <w:lvl w:ilvl="8" w:tplc="0426001B" w:tentative="1">
+      <w:start w:val="1"/>
+      <w:numFmt w:val="lowerRoman"/>
+      <w:lvlText w:val="%9."/>
+      <w:lvlJc w:val="right"/>
+      <w:pPr>
+        <w:ind w:left="6840" w:hanging="180"/>
+      </w:pPr>
+    </w:lvl>
+  </w:abstractNum>
+  <w:num w:numId="1">
+    <w:abstractNumId w:val="3"/>
   </w:num>
-  <w:num w:numId="2" w16cid:durableId="2063284056">
+  <w:num w:numId="2">
     <w:abstractNumId w:val="1"/>
   </w:num>
-  <w:num w:numId="3" w16cid:durableId="519198313">
+  <w:num w:numId="3">
     <w:abstractNumId w:val="0"/>
   </w:num>
-  <w:num w:numId="4" w16cid:durableId="1857621438">
+  <w:num w:numId="4">
+    <w:abstractNumId w:val="5"/>
+  </w:num>
+  <w:num w:numId="5">
     <w:abstractNumId w:val="4"/>
   </w:num>
-  <w:num w:numId="5" w16cid:durableId="151485609">
-    <w:abstractNumId w:val="3"/>
+  <w:num w:numId="6">
+    <w:abstractNumId w:val="6"/>
+  </w:num>
+  <w:num w:numId="7">
+    <w:abstractNumId w:val="2"/>
   </w:num>
 </w:numbering>
 </file>
 
 <file path=word/styles.xml><?xml version="1.0" encoding="utf-8"?>
-<w:styles xmlns:mc="http://schemas.openxmlformats.org/markup-compatibility/2006" xmlns:r="http://schemas.openxmlformats.org/officeDocument/2006/relationships" xmlns:w="http://schemas.openxmlformats.org/wordprocessingml/2006/main" xmlns:w14="http://schemas.microsoft.com/office/word/2010/wordml" xmlns:w15="http://schemas.microsoft.com/office/word/2012/wordml" xmlns:w16cex="http://schemas.microsoft.com/office/word/2018/wordml/cex" xmlns:w16cid="http://schemas.microsoft.com/office/word/2016/wordml/cid" xmlns:w16="http://schemas.microsoft.com/office/word/2018/wordml" xmlns:w16du="http://schemas.microsoft.com/office/word/2023/wordml/word16du" xmlns:w16sdtdh="http://schemas.microsoft.com/office/word/2020/wordml/sdtdatahash" xmlns:w16se="http://schemas.microsoft.com/office/word/2015/wordml/symex" mc:Ignorable="w14 w15 w16se w16cid w16 w16cex w16sdtdh w16du">
+<w:styles xmlns:mc="http://schemas.openxmlformats.org/markup-compatibility/2006" xmlns:r="http://schemas.openxmlformats.org/officeDocument/2006/relationships" xmlns:w="http://schemas.openxmlformats.org/wordprocessingml/2006/main" xmlns:w14="http://schemas.microsoft.com/office/word/2010/wordml" xmlns:w15="http://schemas.microsoft.com/office/word/2012/wordml" xmlns:w16se="http://schemas.microsoft.com/office/word/2015/wordml/symex" mc:Ignorable="w14 w15 w16se">
   <w:docDefaults>
     <w:rPrDefault>
       <w:rPr>
@@ -2201,7 +2721,7 @@
       </w:pPr>
     </w:pPrDefault>
   </w:docDefaults>
-  <w:latentStyles w:defLockedState="0" w:defUIPriority="99" w:defSemiHidden="0" w:defUnhideWhenUsed="0" w:defQFormat="0" w:count="376">
+  <w:latentStyles w:defLockedState="0" w:defUIPriority="99" w:defSemiHidden="0" w:defUnhideWhenUsed="0" w:defQFormat="0" w:count="371">
     <w:lsdException w:name="Normal" w:uiPriority="0" w:qFormat="1"/>
     <w:lsdException w:name="heading 1" w:uiPriority="9" w:qFormat="1"/>
     <w:lsdException w:name="heading 2" w:semiHidden="1" w:uiPriority="9" w:unhideWhenUsed="1" w:qFormat="1"/>
@@ -2573,11 +3093,6 @@
     <w:lsdException w:name="List Table 5 Dark Accent 6" w:uiPriority="50"/>
     <w:lsdException w:name="List Table 6 Colorful Accent 6" w:uiPriority="51"/>
     <w:lsdException w:name="List Table 7 Colorful Accent 6" w:uiPriority="52"/>
-    <w:lsdException w:name="Mention" w:semiHidden="1" w:unhideWhenUsed="1"/>
-    <w:lsdException w:name="Smart Hyperlink" w:semiHidden="1" w:unhideWhenUsed="1"/>
-    <w:lsdException w:name="Hashtag" w:semiHidden="1" w:unhideWhenUsed="1"/>
-    <w:lsdException w:name="Unresolved Mention" w:semiHidden="1" w:unhideWhenUsed="1"/>
-    <w:lsdException w:name="Smart Link" w:semiHidden="1" w:unhideWhenUsed="1"/>
   </w:latentStyles>
   <w:style w:type="paragraph" w:default="1" w:styleId="Normal">
     <w:name w:val="Normal"/>
@@ -3029,7 +3544,7 @@
 </file>
 
 <file path=customXml/itemProps1.xml><?xml version="1.0" encoding="utf-8"?>
-<ds:datastoreItem xmlns:ds="http://schemas.openxmlformats.org/officeDocument/2006/customXml" ds:itemID="{CC262454-12C3-404A-893F-FFEA031430FE}">
+<ds:datastoreItem xmlns:ds="http://schemas.openxmlformats.org/officeDocument/2006/customXml" ds:itemID="{11619BD4-ACE5-42A0-A496-A35DC0CF1025}">
   <ds:schemaRefs>
     <ds:schemaRef ds:uri="http://schemas.openxmlformats.org/officeDocument/2006/bibliography"/>
   </ds:schemaRefs>

</xml_diff>